<commit_message>
Add real GitHub link to packet header now that the repo is public
</commit_message>
<xml_diff>
--- a/packet/NCAA_Revenue_Analysis_Packet.docx
+++ b/packet/NCAA_Revenue_Analysis_Packet.docx
@@ -27,7 +27,17 @@
           <w:sz w:val="19"/>
           <w:szCs w:val="19"/>
         </w:rPr>
-        <w:t xml:space="preserve">Zach Keller  ·  Data Analytics Project</w:t>
+        <w:t xml:space="preserve">Zach Keller  ·  Data Analytics Project  ·  </w:t>
+      </w:r>
+      <w:r>
+        <w:rPr>
+          <w:i/>
+          <w:iCs/>
+          <w:color w:val="595959"/>
+          <w:sz w:val="19"/>
+          <w:szCs w:val="19"/>
+        </w:rPr>
+        <w:t xml:space="preserve">github.com/kellerzachary117/ncaa-revenue-analysis</w:t>
       </w:r>
     </w:p>
     <w:p>

</xml_diff>

<commit_message>
Remove em dashes from packet text
</commit_message>
<xml_diff>
--- a/packet/NCAA_Revenue_Analysis_Packet.docx
+++ b/packet/NCAA_Revenue_Analysis_Packet.docx
@@ -99,7 +99,7 @@
           <w:sz w:val="20"/>
           <w:szCs w:val="20"/>
         </w:rPr>
-        <w:t xml:space="preserve">A stratified random sample (seed 42) of 10 programs from each D1 subdivision, drawn from the full population of 356 D1 athletic programs in the US Department of Education's EADA database, AY2023-24. Stratifying across subdivisions — rather than a pure random draw, which would have skewed toward the ~250 smaller FCS/no-football programs — was a deliberate choice to get real revenue variation into the sample.</w:t>
+        <w:t xml:space="preserve">A stratified random sample (seed 42) of 10 programs from each D1 subdivision, drawn from the full population of 356 D1 athletic programs in the US Department of Education's EADA database, AY2023-24. Stratifying across subdivisions, rather than a pure random draw (which would have skewed toward the ~250 smaller FCS/no-football programs), was a deliberate choice to get real revenue variation into the sample.</w:t>
       </w:r>
     </w:p>
     <w:tbl>
@@ -228,59 +228,59 @@
                 <w:sz w:val="16"/>
                 <w:szCs w:val="16"/>
               </w:rPr>
-              <w:t xml:space="preserve">Michigan — $221M</w:t>
-            </w:r>
-          </w:p>
-        </w:tc>
-        <w:tc>
-          <w:tcPr>
-            <w:tcW w:type="dxa" w:w="3600"/>
-            <w:tcMar>
-              <w:top w:type="dxa" w:w="40"/>
-              <w:left w:type="dxa" w:w="100"/>
-              <w:bottom w:type="dxa" w:w="40"/>
-              <w:right w:type="dxa" w:w="100"/>
-            </w:tcMar>
-          </w:tcPr>
-          <w:p>
-            <w:pPr>
-              <w:spacing w:after="0"/>
-            </w:pPr>
-            <w:r>
-              <w:rPr>
-                <w:b w:val="false"/>
-                <w:bCs w:val="false"/>
-                <w:color w:val="000000"/>
-                <w:sz w:val="16"/>
-                <w:szCs w:val="16"/>
-              </w:rPr>
-              <w:t xml:space="preserve">Illinois State — $31M</w:t>
-            </w:r>
-          </w:p>
-        </w:tc>
-        <w:tc>
-          <w:tcPr>
-            <w:tcW w:type="dxa" w:w="3600"/>
-            <w:tcMar>
-              <w:top w:type="dxa" w:w="40"/>
-              <w:left w:type="dxa" w:w="100"/>
-              <w:bottom w:type="dxa" w:w="40"/>
-              <w:right w:type="dxa" w:w="100"/>
-            </w:tcMar>
-          </w:tcPr>
-          <w:p>
-            <w:pPr>
-              <w:spacing w:after="0"/>
-            </w:pPr>
-            <w:r>
-              <w:rPr>
-                <w:b w:val="false"/>
-                <w:bCs w:val="false"/>
-                <w:color w:val="000000"/>
-                <w:sz w:val="16"/>
-                <w:szCs w:val="16"/>
-              </w:rPr>
-              <w:t xml:space="preserve">St. John's (NY) — $54M</w:t>
+              <w:t xml:space="preserve">Michigan: $221M</w:t>
+            </w:r>
+          </w:p>
+        </w:tc>
+        <w:tc>
+          <w:tcPr>
+            <w:tcW w:type="dxa" w:w="3600"/>
+            <w:tcMar>
+              <w:top w:type="dxa" w:w="40"/>
+              <w:left w:type="dxa" w:w="100"/>
+              <w:bottom w:type="dxa" w:w="40"/>
+              <w:right w:type="dxa" w:w="100"/>
+            </w:tcMar>
+          </w:tcPr>
+          <w:p>
+            <w:pPr>
+              <w:spacing w:after="0"/>
+            </w:pPr>
+            <w:r>
+              <w:rPr>
+                <w:b w:val="false"/>
+                <w:bCs w:val="false"/>
+                <w:color w:val="000000"/>
+                <w:sz w:val="16"/>
+                <w:szCs w:val="16"/>
+              </w:rPr>
+              <w:t xml:space="preserve">Illinois State: $31M</w:t>
+            </w:r>
+          </w:p>
+        </w:tc>
+        <w:tc>
+          <w:tcPr>
+            <w:tcW w:type="dxa" w:w="3600"/>
+            <w:tcMar>
+              <w:top w:type="dxa" w:w="40"/>
+              <w:left w:type="dxa" w:w="100"/>
+              <w:bottom w:type="dxa" w:w="40"/>
+              <w:right w:type="dxa" w:w="100"/>
+            </w:tcMar>
+          </w:tcPr>
+          <w:p>
+            <w:pPr>
+              <w:spacing w:after="0"/>
+            </w:pPr>
+            <w:r>
+              <w:rPr>
+                <w:b w:val="false"/>
+                <w:bCs w:val="false"/>
+                <w:color w:val="000000"/>
+                <w:sz w:val="16"/>
+                <w:szCs w:val="16"/>
+              </w:rPr>
+              <w:t xml:space="preserve">St. John's (NY): $54M</w:t>
             </w:r>
           </w:p>
         </w:tc>
@@ -308,59 +308,59 @@
                 <w:sz w:val="16"/>
                 <w:szCs w:val="16"/>
               </w:rPr>
-              <w:t xml:space="preserve">Kansas — $215M</w:t>
-            </w:r>
-          </w:p>
-        </w:tc>
-        <w:tc>
-          <w:tcPr>
-            <w:tcW w:type="dxa" w:w="3600"/>
-            <w:tcMar>
-              <w:top w:type="dxa" w:w="40"/>
-              <w:left w:type="dxa" w:w="100"/>
-              <w:bottom w:type="dxa" w:w="40"/>
-              <w:right w:type="dxa" w:w="100"/>
-            </w:tcMar>
-          </w:tcPr>
-          <w:p>
-            <w:pPr>
-              <w:spacing w:after="0"/>
-            </w:pPr>
-            <w:r>
-              <w:rPr>
-                <w:b w:val="false"/>
-                <w:bCs w:val="false"/>
-                <w:color w:val="000000"/>
-                <w:sz w:val="16"/>
-                <w:szCs w:val="16"/>
-              </w:rPr>
-              <w:t xml:space="preserve">North Dakota State — $30M</w:t>
-            </w:r>
-          </w:p>
-        </w:tc>
-        <w:tc>
-          <w:tcPr>
-            <w:tcW w:type="dxa" w:w="3600"/>
-            <w:tcMar>
-              <w:top w:type="dxa" w:w="40"/>
-              <w:left w:type="dxa" w:w="100"/>
-              <w:bottom w:type="dxa" w:w="40"/>
-              <w:right w:type="dxa" w:w="100"/>
-            </w:tcMar>
-          </w:tcPr>
-          <w:p>
-            <w:pPr>
-              <w:spacing w:after="0"/>
-            </w:pPr>
-            <w:r>
-              <w:rPr>
-                <w:b w:val="false"/>
-                <w:bCs w:val="false"/>
-                <w:color w:val="000000"/>
-                <w:sz w:val="16"/>
-                <w:szCs w:val="16"/>
-              </w:rPr>
-              <w:t xml:space="preserve">Marquette — $47M</w:t>
+              <w:t xml:space="preserve">Kansas: $215M</w:t>
+            </w:r>
+          </w:p>
+        </w:tc>
+        <w:tc>
+          <w:tcPr>
+            <w:tcW w:type="dxa" w:w="3600"/>
+            <w:tcMar>
+              <w:top w:type="dxa" w:w="40"/>
+              <w:left w:type="dxa" w:w="100"/>
+              <w:bottom w:type="dxa" w:w="40"/>
+              <w:right w:type="dxa" w:w="100"/>
+            </w:tcMar>
+          </w:tcPr>
+          <w:p>
+            <w:pPr>
+              <w:spacing w:after="0"/>
+            </w:pPr>
+            <w:r>
+              <w:rPr>
+                <w:b w:val="false"/>
+                <w:bCs w:val="false"/>
+                <w:color w:val="000000"/>
+                <w:sz w:val="16"/>
+                <w:szCs w:val="16"/>
+              </w:rPr>
+              <w:t xml:space="preserve">North Dakota State: $30M</w:t>
+            </w:r>
+          </w:p>
+        </w:tc>
+        <w:tc>
+          <w:tcPr>
+            <w:tcW w:type="dxa" w:w="3600"/>
+            <w:tcMar>
+              <w:top w:type="dxa" w:w="40"/>
+              <w:left w:type="dxa" w:w="100"/>
+              <w:bottom w:type="dxa" w:w="40"/>
+              <w:right w:type="dxa" w:w="100"/>
+            </w:tcMar>
+          </w:tcPr>
+          <w:p>
+            <w:pPr>
+              <w:spacing w:after="0"/>
+            </w:pPr>
+            <w:r>
+              <w:rPr>
+                <w:b w:val="false"/>
+                <w:bCs w:val="false"/>
+                <w:color w:val="000000"/>
+                <w:sz w:val="16"/>
+                <w:szCs w:val="16"/>
+              </w:rPr>
+              <w:t xml:space="preserve">Marquette: $47M</w:t>
             </w:r>
           </w:p>
         </w:tc>
@@ -388,59 +388,59 @@
                 <w:sz w:val="16"/>
                 <w:szCs w:val="16"/>
               </w:rPr>
-              <w:t xml:space="preserve">Michigan State — $164M</w:t>
-            </w:r>
-          </w:p>
-        </w:tc>
-        <w:tc>
-          <w:tcPr>
-            <w:tcW w:type="dxa" w:w="3600"/>
-            <w:tcMar>
-              <w:top w:type="dxa" w:w="40"/>
-              <w:left w:type="dxa" w:w="100"/>
-              <w:bottom w:type="dxa" w:w="40"/>
-              <w:right w:type="dxa" w:w="100"/>
-            </w:tcMar>
-          </w:tcPr>
-          <w:p>
-            <w:pPr>
-              <w:spacing w:after="0"/>
-            </w:pPr>
-            <w:r>
-              <w:rPr>
-                <w:b w:val="false"/>
-                <w:bCs w:val="false"/>
-                <w:color w:val="000000"/>
-                <w:sz w:val="16"/>
-                <w:szCs w:val="16"/>
-              </w:rPr>
-              <w:t xml:space="preserve">Missouri State — $25M</w:t>
-            </w:r>
-          </w:p>
-        </w:tc>
-        <w:tc>
-          <w:tcPr>
-            <w:tcW w:type="dxa" w:w="3600"/>
-            <w:tcMar>
-              <w:top w:type="dxa" w:w="40"/>
-              <w:left w:type="dxa" w:w="100"/>
-              <w:bottom w:type="dxa" w:w="40"/>
-              <w:right w:type="dxa" w:w="100"/>
-            </w:tcMar>
-          </w:tcPr>
-          <w:p>
-            <w:pPr>
-              <w:spacing w:after="0"/>
-            </w:pPr>
-            <w:r>
-              <w:rPr>
-                <w:b w:val="false"/>
-                <w:bCs w:val="false"/>
-                <w:color w:val="000000"/>
-                <w:sz w:val="16"/>
-                <w:szCs w:val="16"/>
-              </w:rPr>
-              <w:t xml:space="preserve">Loyola Marymount — $40M</w:t>
+              <w:t xml:space="preserve">Michigan State: $164M</w:t>
+            </w:r>
+          </w:p>
+        </w:tc>
+        <w:tc>
+          <w:tcPr>
+            <w:tcW w:type="dxa" w:w="3600"/>
+            <w:tcMar>
+              <w:top w:type="dxa" w:w="40"/>
+              <w:left w:type="dxa" w:w="100"/>
+              <w:bottom w:type="dxa" w:w="40"/>
+              <w:right w:type="dxa" w:w="100"/>
+            </w:tcMar>
+          </w:tcPr>
+          <w:p>
+            <w:pPr>
+              <w:spacing w:after="0"/>
+            </w:pPr>
+            <w:r>
+              <w:rPr>
+                <w:b w:val="false"/>
+                <w:bCs w:val="false"/>
+                <w:color w:val="000000"/>
+                <w:sz w:val="16"/>
+                <w:szCs w:val="16"/>
+              </w:rPr>
+              <w:t xml:space="preserve">Missouri State: $25M</w:t>
+            </w:r>
+          </w:p>
+        </w:tc>
+        <w:tc>
+          <w:tcPr>
+            <w:tcW w:type="dxa" w:w="3600"/>
+            <w:tcMar>
+              <w:top w:type="dxa" w:w="40"/>
+              <w:left w:type="dxa" w:w="100"/>
+              <w:bottom w:type="dxa" w:w="40"/>
+              <w:right w:type="dxa" w:w="100"/>
+            </w:tcMar>
+          </w:tcPr>
+          <w:p>
+            <w:pPr>
+              <w:spacing w:after="0"/>
+            </w:pPr>
+            <w:r>
+              <w:rPr>
+                <w:b w:val="false"/>
+                <w:bCs w:val="false"/>
+                <w:color w:val="000000"/>
+                <w:sz w:val="16"/>
+                <w:szCs w:val="16"/>
+              </w:rPr>
+              <w:t xml:space="preserve">Loyola Marymount: $40M</w:t>
             </w:r>
           </w:p>
         </w:tc>
@@ -468,59 +468,59 @@
                 <w:sz w:val="16"/>
                 <w:szCs w:val="16"/>
               </w:rPr>
-              <w:t xml:space="preserve">BYU — $130M</w:t>
-            </w:r>
-          </w:p>
-        </w:tc>
-        <w:tc>
-          <w:tcPr>
-            <w:tcW w:type="dxa" w:w="3600"/>
-            <w:tcMar>
-              <w:top w:type="dxa" w:w="40"/>
-              <w:left w:type="dxa" w:w="100"/>
-              <w:bottom w:type="dxa" w:w="40"/>
-              <w:right w:type="dxa" w:w="100"/>
-            </w:tcMar>
-          </w:tcPr>
-          <w:p>
-            <w:pPr>
-              <w:spacing w:after="0"/>
-            </w:pPr>
-            <w:r>
-              <w:rPr>
-                <w:b w:val="false"/>
-                <w:bCs w:val="false"/>
-                <w:color w:val="000000"/>
-                <w:sz w:val="16"/>
-                <w:szCs w:val="16"/>
-              </w:rPr>
-              <w:t xml:space="preserve">UT Chattanooga — $23M</w:t>
-            </w:r>
-          </w:p>
-        </w:tc>
-        <w:tc>
-          <w:tcPr>
-            <w:tcW w:type="dxa" w:w="3600"/>
-            <w:tcMar>
-              <w:top w:type="dxa" w:w="40"/>
-              <w:left w:type="dxa" w:w="100"/>
-              <w:bottom w:type="dxa" w:w="40"/>
-              <w:right w:type="dxa" w:w="100"/>
-            </w:tcMar>
-          </w:tcPr>
-          <w:p>
-            <w:pPr>
-              <w:spacing w:after="0"/>
-            </w:pPr>
-            <w:r>
-              <w:rPr>
-                <w:b w:val="false"/>
-                <w:bCs w:val="false"/>
-                <w:color w:val="000000"/>
-                <w:sz w:val="16"/>
-                <w:szCs w:val="16"/>
-              </w:rPr>
-              <w:t xml:space="preserve">High Point — $33M</w:t>
+              <w:t xml:space="preserve">BYU: $130M</w:t>
+            </w:r>
+          </w:p>
+        </w:tc>
+        <w:tc>
+          <w:tcPr>
+            <w:tcW w:type="dxa" w:w="3600"/>
+            <w:tcMar>
+              <w:top w:type="dxa" w:w="40"/>
+              <w:left w:type="dxa" w:w="100"/>
+              <w:bottom w:type="dxa" w:w="40"/>
+              <w:right w:type="dxa" w:w="100"/>
+            </w:tcMar>
+          </w:tcPr>
+          <w:p>
+            <w:pPr>
+              <w:spacing w:after="0"/>
+            </w:pPr>
+            <w:r>
+              <w:rPr>
+                <w:b w:val="false"/>
+                <w:bCs w:val="false"/>
+                <w:color w:val="000000"/>
+                <w:sz w:val="16"/>
+                <w:szCs w:val="16"/>
+              </w:rPr>
+              <w:t xml:space="preserve">UT Chattanooga: $23M</w:t>
+            </w:r>
+          </w:p>
+        </w:tc>
+        <w:tc>
+          <w:tcPr>
+            <w:tcW w:type="dxa" w:w="3600"/>
+            <w:tcMar>
+              <w:top w:type="dxa" w:w="40"/>
+              <w:left w:type="dxa" w:w="100"/>
+              <w:bottom w:type="dxa" w:w="40"/>
+              <w:right w:type="dxa" w:w="100"/>
+            </w:tcMar>
+          </w:tcPr>
+          <w:p>
+            <w:pPr>
+              <w:spacing w:after="0"/>
+            </w:pPr>
+            <w:r>
+              <w:rPr>
+                <w:b w:val="false"/>
+                <w:bCs w:val="false"/>
+                <w:color w:val="000000"/>
+                <w:sz w:val="16"/>
+                <w:szCs w:val="16"/>
+              </w:rPr>
+              <w:t xml:space="preserve">High Point: $33M</w:t>
             </w:r>
           </w:p>
         </w:tc>
@@ -548,59 +548,59 @@
                 <w:sz w:val="16"/>
                 <w:szCs w:val="16"/>
               </w:rPr>
-              <w:t xml:space="preserve">Georgia Tech — $128M</w:t>
-            </w:r>
-          </w:p>
-        </w:tc>
-        <w:tc>
-          <w:tcPr>
-            <w:tcW w:type="dxa" w:w="3600"/>
-            <w:tcMar>
-              <w:top w:type="dxa" w:w="40"/>
-              <w:left w:type="dxa" w:w="100"/>
-              <w:bottom w:type="dxa" w:w="40"/>
-              <w:right w:type="dxa" w:w="100"/>
-            </w:tcMar>
-          </w:tcPr>
-          <w:p>
-            <w:pPr>
-              <w:spacing w:after="0"/>
-            </w:pPr>
-            <w:r>
-              <w:rPr>
-                <w:b w:val="false"/>
-                <w:bCs w:val="false"/>
-                <w:color w:val="000000"/>
-                <w:sz w:val="16"/>
-                <w:szCs w:val="16"/>
-              </w:rPr>
-              <w:t xml:space="preserve">Marist — $22M</w:t>
-            </w:r>
-          </w:p>
-        </w:tc>
-        <w:tc>
-          <w:tcPr>
-            <w:tcW w:type="dxa" w:w="3600"/>
-            <w:tcMar>
-              <w:top w:type="dxa" w:w="40"/>
-              <w:left w:type="dxa" w:w="100"/>
-              <w:bottom w:type="dxa" w:w="40"/>
-              <w:right w:type="dxa" w:w="100"/>
-            </w:tcMar>
-          </w:tcPr>
-          <w:p>
-            <w:pPr>
-              <w:spacing w:after="0"/>
-            </w:pPr>
-            <w:r>
-              <w:rPr>
-                <w:b w:val="false"/>
-                <w:bCs w:val="false"/>
-                <w:color w:val="000000"/>
-                <w:sz w:val="16"/>
-                <w:szCs w:val="16"/>
-              </w:rPr>
-              <w:t xml:space="preserve">Quinnipiac — $32M</w:t>
+              <w:t xml:space="preserve">Georgia Tech: $128M</w:t>
+            </w:r>
+          </w:p>
+        </w:tc>
+        <w:tc>
+          <w:tcPr>
+            <w:tcW w:type="dxa" w:w="3600"/>
+            <w:tcMar>
+              <w:top w:type="dxa" w:w="40"/>
+              <w:left w:type="dxa" w:w="100"/>
+              <w:bottom w:type="dxa" w:w="40"/>
+              <w:right w:type="dxa" w:w="100"/>
+            </w:tcMar>
+          </w:tcPr>
+          <w:p>
+            <w:pPr>
+              <w:spacing w:after="0"/>
+            </w:pPr>
+            <w:r>
+              <w:rPr>
+                <w:b w:val="false"/>
+                <w:bCs w:val="false"/>
+                <w:color w:val="000000"/>
+                <w:sz w:val="16"/>
+                <w:szCs w:val="16"/>
+              </w:rPr>
+              <w:t xml:space="preserve">Marist: $22M</w:t>
+            </w:r>
+          </w:p>
+        </w:tc>
+        <w:tc>
+          <w:tcPr>
+            <w:tcW w:type="dxa" w:w="3600"/>
+            <w:tcMar>
+              <w:top w:type="dxa" w:w="40"/>
+              <w:left w:type="dxa" w:w="100"/>
+              <w:bottom w:type="dxa" w:w="40"/>
+              <w:right w:type="dxa" w:w="100"/>
+            </w:tcMar>
+          </w:tcPr>
+          <w:p>
+            <w:pPr>
+              <w:spacing w:after="0"/>
+            </w:pPr>
+            <w:r>
+              <w:rPr>
+                <w:b w:val="false"/>
+                <w:bCs w:val="false"/>
+                <w:color w:val="000000"/>
+                <w:sz w:val="16"/>
+                <w:szCs w:val="16"/>
+              </w:rPr>
+              <w:t xml:space="preserve">Quinnipiac: $32M</w:t>
             </w:r>
           </w:p>
         </w:tc>
@@ -628,59 +628,59 @@
                 <w:sz w:val="16"/>
                 <w:szCs w:val="16"/>
               </w:rPr>
-              <w:t xml:space="preserve">UCF — $93M</w:t>
-            </w:r>
-          </w:p>
-        </w:tc>
-        <w:tc>
-          <w:tcPr>
-            <w:tcW w:type="dxa" w:w="3600"/>
-            <w:tcMar>
-              <w:top w:type="dxa" w:w="40"/>
-              <w:left w:type="dxa" w:w="100"/>
-              <w:bottom w:type="dxa" w:w="40"/>
-              <w:right w:type="dxa" w:w="100"/>
-            </w:tcMar>
-          </w:tcPr>
-          <w:p>
-            <w:pPr>
-              <w:spacing w:after="0"/>
-            </w:pPr>
-            <w:r>
-              <w:rPr>
-                <w:b w:val="false"/>
-                <w:bCs w:val="false"/>
-                <w:color w:val="000000"/>
-                <w:sz w:val="16"/>
-                <w:szCs w:val="16"/>
-              </w:rPr>
-              <w:t xml:space="preserve">Valparaiso — $16M</w:t>
-            </w:r>
-          </w:p>
-        </w:tc>
-        <w:tc>
-          <w:tcPr>
-            <w:tcW w:type="dxa" w:w="3600"/>
-            <w:tcMar>
-              <w:top w:type="dxa" w:w="40"/>
-              <w:left w:type="dxa" w:w="100"/>
-              <w:bottom w:type="dxa" w:w="40"/>
-              <w:right w:type="dxa" w:w="100"/>
-            </w:tcMar>
-          </w:tcPr>
-          <w:p>
-            <w:pPr>
-              <w:spacing w:after="0"/>
-            </w:pPr>
-            <w:r>
-              <w:rPr>
-                <w:b w:val="false"/>
-                <w:bCs w:val="false"/>
-                <w:color w:val="000000"/>
-                <w:sz w:val="16"/>
-                <w:szCs w:val="16"/>
-              </w:rPr>
-              <w:t xml:space="preserve">Grand Canyon — $31M</w:t>
+              <w:t xml:space="preserve">UCF: $93M</w:t>
+            </w:r>
+          </w:p>
+        </w:tc>
+        <w:tc>
+          <w:tcPr>
+            <w:tcW w:type="dxa" w:w="3600"/>
+            <w:tcMar>
+              <w:top w:type="dxa" w:w="40"/>
+              <w:left w:type="dxa" w:w="100"/>
+              <w:bottom w:type="dxa" w:w="40"/>
+              <w:right w:type="dxa" w:w="100"/>
+            </w:tcMar>
+          </w:tcPr>
+          <w:p>
+            <w:pPr>
+              <w:spacing w:after="0"/>
+            </w:pPr>
+            <w:r>
+              <w:rPr>
+                <w:b w:val="false"/>
+                <w:bCs w:val="false"/>
+                <w:color w:val="000000"/>
+                <w:sz w:val="16"/>
+                <w:szCs w:val="16"/>
+              </w:rPr>
+              <w:t xml:space="preserve">Valparaiso: $16M</w:t>
+            </w:r>
+          </w:p>
+        </w:tc>
+        <w:tc>
+          <w:tcPr>
+            <w:tcW w:type="dxa" w:w="3600"/>
+            <w:tcMar>
+              <w:top w:type="dxa" w:w="40"/>
+              <w:left w:type="dxa" w:w="100"/>
+              <w:bottom w:type="dxa" w:w="40"/>
+              <w:right w:type="dxa" w:w="100"/>
+            </w:tcMar>
+          </w:tcPr>
+          <w:p>
+            <w:pPr>
+              <w:spacing w:after="0"/>
+            </w:pPr>
+            <w:r>
+              <w:rPr>
+                <w:b w:val="false"/>
+                <w:bCs w:val="false"/>
+                <w:color w:val="000000"/>
+                <w:sz w:val="16"/>
+                <w:szCs w:val="16"/>
+              </w:rPr>
+              <w:t xml:space="preserve">Grand Canyon: $31M</w:t>
             </w:r>
           </w:p>
         </w:tc>
@@ -708,59 +708,59 @@
                 <w:sz w:val="16"/>
                 <w:szCs w:val="16"/>
               </w:rPr>
-              <w:t xml:space="preserve">Boise State — $60M</w:t>
-            </w:r>
-          </w:p>
-        </w:tc>
-        <w:tc>
-          <w:tcPr>
-            <w:tcW w:type="dxa" w:w="3600"/>
-            <w:tcMar>
-              <w:top w:type="dxa" w:w="40"/>
-              <w:left w:type="dxa" w:w="100"/>
-              <w:bottom w:type="dxa" w:w="40"/>
-              <w:right w:type="dxa" w:w="100"/>
-            </w:tcMar>
-          </w:tcPr>
-          <w:p>
-            <w:pPr>
-              <w:spacing w:after="0"/>
-            </w:pPr>
-            <w:r>
-              <w:rPr>
-                <w:b w:val="false"/>
-                <w:bCs w:val="false"/>
-                <w:color w:val="000000"/>
-                <w:sz w:val="16"/>
-                <w:szCs w:val="16"/>
-              </w:rPr>
-              <w:t xml:space="preserve">SE Missouri State — $16M</w:t>
-            </w:r>
-          </w:p>
-        </w:tc>
-        <w:tc>
-          <w:tcPr>
-            <w:tcW w:type="dxa" w:w="3600"/>
-            <w:tcMar>
-              <w:top w:type="dxa" w:w="40"/>
-              <w:left w:type="dxa" w:w="100"/>
-              <w:bottom w:type="dxa" w:w="40"/>
-              <w:right w:type="dxa" w:w="100"/>
-            </w:tcMar>
-          </w:tcPr>
-          <w:p>
-            <w:pPr>
-              <w:spacing w:after="0"/>
-            </w:pPr>
-            <w:r>
-              <w:rPr>
-                <w:b w:val="false"/>
-                <w:bCs w:val="false"/>
-                <w:color w:val="000000"/>
-                <w:sz w:val="16"/>
-                <w:szCs w:val="16"/>
-              </w:rPr>
-              <w:t xml:space="preserve">UMass Lowell — $24M</w:t>
+              <w:t xml:space="preserve">Boise State: $60M</w:t>
+            </w:r>
+          </w:p>
+        </w:tc>
+        <w:tc>
+          <w:tcPr>
+            <w:tcW w:type="dxa" w:w="3600"/>
+            <w:tcMar>
+              <w:top w:type="dxa" w:w="40"/>
+              <w:left w:type="dxa" w:w="100"/>
+              <w:bottom w:type="dxa" w:w="40"/>
+              <w:right w:type="dxa" w:w="100"/>
+            </w:tcMar>
+          </w:tcPr>
+          <w:p>
+            <w:pPr>
+              <w:spacing w:after="0"/>
+            </w:pPr>
+            <w:r>
+              <w:rPr>
+                <w:b w:val="false"/>
+                <w:bCs w:val="false"/>
+                <w:color w:val="000000"/>
+                <w:sz w:val="16"/>
+                <w:szCs w:val="16"/>
+              </w:rPr>
+              <w:t xml:space="preserve">SE Missouri State: $16M</w:t>
+            </w:r>
+          </w:p>
+        </w:tc>
+        <w:tc>
+          <w:tcPr>
+            <w:tcW w:type="dxa" w:w="3600"/>
+            <w:tcMar>
+              <w:top w:type="dxa" w:w="40"/>
+              <w:left w:type="dxa" w:w="100"/>
+              <w:bottom w:type="dxa" w:w="40"/>
+              <w:right w:type="dxa" w:w="100"/>
+            </w:tcMar>
+          </w:tcPr>
+          <w:p>
+            <w:pPr>
+              <w:spacing w:after="0"/>
+            </w:pPr>
+            <w:r>
+              <w:rPr>
+                <w:b w:val="false"/>
+                <w:bCs w:val="false"/>
+                <w:color w:val="000000"/>
+                <w:sz w:val="16"/>
+                <w:szCs w:val="16"/>
+              </w:rPr>
+              <w:t xml:space="preserve">UMass Lowell: $24M</w:t>
             </w:r>
           </w:p>
         </w:tc>
@@ -788,59 +788,59 @@
                 <w:sz w:val="16"/>
                 <w:szCs w:val="16"/>
               </w:rPr>
-              <w:t xml:space="preserve">Buffalo — $42M</w:t>
-            </w:r>
-          </w:p>
-        </w:tc>
-        <w:tc>
-          <w:tcPr>
-            <w:tcW w:type="dxa" w:w="3600"/>
-            <w:tcMar>
-              <w:top w:type="dxa" w:w="40"/>
-              <w:left w:type="dxa" w:w="100"/>
-              <w:bottom w:type="dxa" w:w="40"/>
-              <w:right w:type="dxa" w:w="100"/>
-            </w:tcMar>
-          </w:tcPr>
-          <w:p>
-            <w:pPr>
-              <w:spacing w:after="0"/>
-            </w:pPr>
-            <w:r>
-              <w:rPr>
-                <w:b w:val="false"/>
-                <w:bCs w:val="false"/>
-                <w:color w:val="000000"/>
-                <w:sz w:val="16"/>
-                <w:szCs w:val="16"/>
-              </w:rPr>
-              <w:t xml:space="preserve">Prairie View A&amp;M — $15M</w:t>
-            </w:r>
-          </w:p>
-        </w:tc>
-        <w:tc>
-          <w:tcPr>
-            <w:tcW w:type="dxa" w:w="3600"/>
-            <w:tcMar>
-              <w:top w:type="dxa" w:w="40"/>
-              <w:left w:type="dxa" w:w="100"/>
-              <w:bottom w:type="dxa" w:w="40"/>
-              <w:right w:type="dxa" w:w="100"/>
-            </w:tcMar>
-          </w:tcPr>
-          <w:p>
-            <w:pPr>
-              <w:spacing w:after="0"/>
-            </w:pPr>
-            <w:r>
-              <w:rPr>
-                <w:b w:val="false"/>
-                <w:bCs w:val="false"/>
-                <w:color w:val="000000"/>
-                <w:sz w:val="16"/>
-                <w:szCs w:val="16"/>
-              </w:rPr>
-              <w:t xml:space="preserve">Belmont — $23M</w:t>
+              <w:t xml:space="preserve">Buffalo: $42M</w:t>
+            </w:r>
+          </w:p>
+        </w:tc>
+        <w:tc>
+          <w:tcPr>
+            <w:tcW w:type="dxa" w:w="3600"/>
+            <w:tcMar>
+              <w:top w:type="dxa" w:w="40"/>
+              <w:left w:type="dxa" w:w="100"/>
+              <w:bottom w:type="dxa" w:w="40"/>
+              <w:right w:type="dxa" w:w="100"/>
+            </w:tcMar>
+          </w:tcPr>
+          <w:p>
+            <w:pPr>
+              <w:spacing w:after="0"/>
+            </w:pPr>
+            <w:r>
+              <w:rPr>
+                <w:b w:val="false"/>
+                <w:bCs w:val="false"/>
+                <w:color w:val="000000"/>
+                <w:sz w:val="16"/>
+                <w:szCs w:val="16"/>
+              </w:rPr>
+              <w:t xml:space="preserve">Prairie View A&amp;M: $15M</w:t>
+            </w:r>
+          </w:p>
+        </w:tc>
+        <w:tc>
+          <w:tcPr>
+            <w:tcW w:type="dxa" w:w="3600"/>
+            <w:tcMar>
+              <w:top w:type="dxa" w:w="40"/>
+              <w:left w:type="dxa" w:w="100"/>
+              <w:bottom w:type="dxa" w:w="40"/>
+              <w:right w:type="dxa" w:w="100"/>
+            </w:tcMar>
+          </w:tcPr>
+          <w:p>
+            <w:pPr>
+              <w:spacing w:after="0"/>
+            </w:pPr>
+            <w:r>
+              <w:rPr>
+                <w:b w:val="false"/>
+                <w:bCs w:val="false"/>
+                <w:color w:val="000000"/>
+                <w:sz w:val="16"/>
+                <w:szCs w:val="16"/>
+              </w:rPr>
+              <w:t xml:space="preserve">Belmont: $23M</w:t>
             </w:r>
           </w:p>
         </w:tc>
@@ -868,59 +868,59 @@
                 <w:sz w:val="16"/>
                 <w:szCs w:val="16"/>
               </w:rPr>
-              <w:t xml:space="preserve">Kent State — $35M</w:t>
-            </w:r>
-          </w:p>
-        </w:tc>
-        <w:tc>
-          <w:tcPr>
-            <w:tcW w:type="dxa" w:w="3600"/>
-            <w:tcMar>
-              <w:top w:type="dxa" w:w="40"/>
-              <w:left w:type="dxa" w:w="100"/>
-              <w:bottom w:type="dxa" w:w="40"/>
-              <w:right w:type="dxa" w:w="100"/>
-            </w:tcMar>
-          </w:tcPr>
-          <w:p>
-            <w:pPr>
-              <w:spacing w:after="0"/>
-            </w:pPr>
-            <w:r>
-              <w:rPr>
-                <w:b w:val="false"/>
-                <w:bCs w:val="false"/>
-                <w:color w:val="000000"/>
-                <w:sz w:val="16"/>
-                <w:szCs w:val="16"/>
-              </w:rPr>
-              <w:t xml:space="preserve">Northwestern State (LA) — $15M</w:t>
-            </w:r>
-          </w:p>
-        </w:tc>
-        <w:tc>
-          <w:tcPr>
-            <w:tcW w:type="dxa" w:w="3600"/>
-            <w:tcMar>
-              <w:top w:type="dxa" w:w="40"/>
-              <w:left w:type="dxa" w:w="100"/>
-              <w:bottom w:type="dxa" w:w="40"/>
-              <w:right w:type="dxa" w:w="100"/>
-            </w:tcMar>
-          </w:tcPr>
-          <w:p>
-            <w:pPr>
-              <w:spacing w:after="0"/>
-            </w:pPr>
-            <w:r>
-              <w:rPr>
-                <w:b w:val="false"/>
-                <w:bCs w:val="false"/>
-                <w:color w:val="000000"/>
-                <w:sz w:val="16"/>
-                <w:szCs w:val="16"/>
-              </w:rPr>
-              <w:t xml:space="preserve">Mount St. Mary's — $19M</w:t>
+              <w:t xml:space="preserve">Kent State: $35M</w:t>
+            </w:r>
+          </w:p>
+        </w:tc>
+        <w:tc>
+          <w:tcPr>
+            <w:tcW w:type="dxa" w:w="3600"/>
+            <w:tcMar>
+              <w:top w:type="dxa" w:w="40"/>
+              <w:left w:type="dxa" w:w="100"/>
+              <w:bottom w:type="dxa" w:w="40"/>
+              <w:right w:type="dxa" w:w="100"/>
+            </w:tcMar>
+          </w:tcPr>
+          <w:p>
+            <w:pPr>
+              <w:spacing w:after="0"/>
+            </w:pPr>
+            <w:r>
+              <w:rPr>
+                <w:b w:val="false"/>
+                <w:bCs w:val="false"/>
+                <w:color w:val="000000"/>
+                <w:sz w:val="16"/>
+                <w:szCs w:val="16"/>
+              </w:rPr>
+              <w:t xml:space="preserve">Northwestern State (LA): $15M</w:t>
+            </w:r>
+          </w:p>
+        </w:tc>
+        <w:tc>
+          <w:tcPr>
+            <w:tcW w:type="dxa" w:w="3600"/>
+            <w:tcMar>
+              <w:top w:type="dxa" w:w="40"/>
+              <w:left w:type="dxa" w:w="100"/>
+              <w:bottom w:type="dxa" w:w="40"/>
+              <w:right w:type="dxa" w:w="100"/>
+            </w:tcMar>
+          </w:tcPr>
+          <w:p>
+            <w:pPr>
+              <w:spacing w:after="0"/>
+            </w:pPr>
+            <w:r>
+              <w:rPr>
+                <w:b w:val="false"/>
+                <w:bCs w:val="false"/>
+                <w:color w:val="000000"/>
+                <w:sz w:val="16"/>
+                <w:szCs w:val="16"/>
+              </w:rPr>
+              <w:t xml:space="preserve">Mount St. Mary's: $19M</w:t>
             </w:r>
           </w:p>
         </w:tc>
@@ -948,59 +948,59 @@
                 <w:sz w:val="16"/>
                 <w:szCs w:val="16"/>
               </w:rPr>
-              <w:t xml:space="preserve">Sam Houston State — $27M</w:t>
-            </w:r>
-          </w:p>
-        </w:tc>
-        <w:tc>
-          <w:tcPr>
-            <w:tcW w:type="dxa" w:w="3600"/>
-            <w:tcMar>
-              <w:top w:type="dxa" w:w="40"/>
-              <w:left w:type="dxa" w:w="100"/>
-              <w:bottom w:type="dxa" w:w="40"/>
-              <w:right w:type="dxa" w:w="100"/>
-            </w:tcMar>
-          </w:tcPr>
-          <w:p>
-            <w:pPr>
-              <w:spacing w:after="0"/>
-            </w:pPr>
-            <w:r>
-              <w:rPr>
-                <w:b w:val="false"/>
-                <w:bCs w:val="false"/>
-                <w:color w:val="000000"/>
-                <w:sz w:val="16"/>
-                <w:szCs w:val="16"/>
-              </w:rPr>
-              <w:t xml:space="preserve">Bethune-Cookman — $14M</w:t>
-            </w:r>
-          </w:p>
-        </w:tc>
-        <w:tc>
-          <w:tcPr>
-            <w:tcW w:type="dxa" w:w="3600"/>
-            <w:tcMar>
-              <w:top w:type="dxa" w:w="40"/>
-              <w:left w:type="dxa" w:w="100"/>
-              <w:bottom w:type="dxa" w:w="40"/>
-              <w:right w:type="dxa" w:w="100"/>
-            </w:tcMar>
-          </w:tcPr>
-          <w:p>
-            <w:pPr>
-              <w:spacing w:after="0"/>
-            </w:pPr>
-            <w:r>
-              <w:rPr>
-                <w:b w:val="false"/>
-                <w:bCs w:val="false"/>
-                <w:color w:val="000000"/>
-                <w:sz w:val="16"/>
-                <w:szCs w:val="16"/>
-              </w:rPr>
-              <w:t xml:space="preserve">Texas A&amp;M-Corpus Christi — $16M</w:t>
+              <w:t xml:space="preserve">Sam Houston State: $27M</w:t>
+            </w:r>
+          </w:p>
+        </w:tc>
+        <w:tc>
+          <w:tcPr>
+            <w:tcW w:type="dxa" w:w="3600"/>
+            <w:tcMar>
+              <w:top w:type="dxa" w:w="40"/>
+              <w:left w:type="dxa" w:w="100"/>
+              <w:bottom w:type="dxa" w:w="40"/>
+              <w:right w:type="dxa" w:w="100"/>
+            </w:tcMar>
+          </w:tcPr>
+          <w:p>
+            <w:pPr>
+              <w:spacing w:after="0"/>
+            </w:pPr>
+            <w:r>
+              <w:rPr>
+                <w:b w:val="false"/>
+                <w:bCs w:val="false"/>
+                <w:color w:val="000000"/>
+                <w:sz w:val="16"/>
+                <w:szCs w:val="16"/>
+              </w:rPr>
+              <w:t xml:space="preserve">Bethune-Cookman: $14M</w:t>
+            </w:r>
+          </w:p>
+        </w:tc>
+        <w:tc>
+          <w:tcPr>
+            <w:tcW w:type="dxa" w:w="3600"/>
+            <w:tcMar>
+              <w:top w:type="dxa" w:w="40"/>
+              <w:left w:type="dxa" w:w="100"/>
+              <w:bottom w:type="dxa" w:w="40"/>
+              <w:right w:type="dxa" w:w="100"/>
+            </w:tcMar>
+          </w:tcPr>
+          <w:p>
+            <w:pPr>
+              <w:spacing w:after="0"/>
+            </w:pPr>
+            <w:r>
+              <w:rPr>
+                <w:b w:val="false"/>
+                <w:bCs w:val="false"/>
+                <w:color w:val="000000"/>
+                <w:sz w:val="16"/>
+                <w:szCs w:val="16"/>
+              </w:rPr>
+              <w:t xml:space="preserve">Texas A&amp;M-Corpus Christi: $16M</w:t>
             </w:r>
           </w:p>
         </w:tc>
@@ -1083,7 +1083,7 @@
           <w:sz w:val="20"/>
           <w:szCs w:val="20"/>
         </w:rPr>
-        <w:t xml:space="preserve">Once scholarship investment (student aid as a share of total revenue) enters the model, both revenue and aid share become significant predictors (p = 0.014 and p = 0.021, R² = 0.23). Revenue and total scholarship dollars are highly correlated (r = 0.79) — bigger programs spend more on aid in absolute terms — but it's the share of revenue actually reinvested in student aid that predicts outcomes, not program size by itself.</w:t>
+        <w:t xml:space="preserve">Once scholarship investment (student aid as a share of total revenue) enters the model, both revenue and aid share become significant predictors (p = 0.014 and p = 0.021, R² = 0.23). Revenue and total scholarship dollars are highly correlated (r = 0.79): bigger programs spend more on aid in absolute terms, but it's the share of revenue actually reinvested in student aid that predicts outcomes, not program size by itself.</w:t>
       </w:r>
     </w:p>
     <w:p>
@@ -1135,7 +1135,7 @@
           <w:sz w:val="20"/>
           <w:szCs w:val="20"/>
         </w:rPr>
-        <w:t xml:space="preserve">The revenue relationship holds — and strengthens — when Federal Graduation Rate replaces the NCAA's own Graduation Success Rate as the outcome measure (p = 0.002), confirming the result isn't an artifact of one specific outcome metric.</w:t>
+        <w:t xml:space="preserve">The revenue relationship holds, and strengthens, when Federal Graduation Rate replaces the NCAA's own Graduation Success Rate as the outcome measure (p = 0.002), confirming the result isn't an artifact of one specific outcome metric.</w:t>
       </w:r>
     </w:p>
     <w:p>
@@ -1171,7 +1171,7 @@
           <w:sz w:val="20"/>
           <w:szCs w:val="20"/>
         </w:rPr>
-        <w:t xml:space="preserve">Sourced real athletic-finance data from the US Dept. of Education's EADA (Equity in Athletics Data Analysis) survey, AY2023-24 — the same federal disclosure every D1 athletic department is legally required to file.</w:t>
+        <w:t xml:space="preserve">Sourced real athletic-finance data from the US Dept. of Education's EADA (Equity in Athletics Data Analysis) survey, AY2023-24, the same federal disclosure every D1 athletic department is legally required to file.</w:t>
       </w:r>
     </w:p>
     <w:p>
@@ -1205,7 +1205,7 @@
           <w:sz w:val="20"/>
           <w:szCs w:val="20"/>
         </w:rPr>
-        <w:t xml:space="preserve">Hand-collected student-athlete outcome data (Graduation Success Rate, 2018 entering cohort — the most recent cohort with a completed 6-year window) from the NCAA's own GSR database for all 30 sampled schools, since the NCAA does not offer a bulk-download option.</w:t>
+        <w:t xml:space="preserve">Hand-collected student-athlete outcome data (Graduation Success Rate, 2018 entering cohort, the most recent cohort with a completed 6-year window) from the NCAA's own GSR database for all 30 sampled schools, since the NCAA does not offer a bulk-download option.</w:t>
       </w:r>
     </w:p>
     <w:p>
@@ -1222,7 +1222,7 @@
           <w:sz w:val="20"/>
           <w:szCs w:val="20"/>
         </w:rPr>
-        <w:t xml:space="preserve">Merged the two sources and engineered variables — log revenue, scholarship investment as a share of revenue, enrollment, D1-subdivision indicators — in Python (pandas).</w:t>
+        <w:t xml:space="preserve">Merged the two sources and engineered variables (log revenue, scholarship investment as a share of revenue, enrollment, D1-subdivision indicators) in Python (pandas).</w:t>
       </w:r>
     </w:p>
     <w:p>
@@ -1289,7 +1289,7 @@
           <w:sz w:val="20"/>
           <w:szCs w:val="20"/>
         </w:rPr>
-        <w:t xml:space="preserve">Python (pandas) — data acquisition, sample construction, cleaning, variable construction</w:t>
+        <w:t xml:space="preserve">Python (pandas): data acquisition, sample construction, cleaning, variable construction</w:t>
       </w:r>
     </w:p>
     <w:p>
@@ -1306,7 +1306,7 @@
           <w:sz w:val="20"/>
           <w:szCs w:val="20"/>
         </w:rPr>
-        <w:t xml:space="preserve">Stata (regress, robust standard errors) — the actual regression modeling</w:t>
+        <w:t xml:space="preserve">Stata (regress, robust standard errors): the actual regression modeling</w:t>
       </w:r>
     </w:p>
     <w:p>
@@ -1323,7 +1323,7 @@
           <w:sz w:val="20"/>
           <w:szCs w:val="20"/>
         </w:rPr>
-        <w:t xml:space="preserve">Git — version control for the full pipeline</w:t>
+        <w:t xml:space="preserve">Git: version control for the full pipeline</w:t>
       </w:r>
     </w:p>
     <w:p>
@@ -1371,7 +1371,7 @@
           <w:sz w:val="20"/>
           <w:szCs w:val="20"/>
         </w:rPr>
-        <w:t xml:space="preserve">Lead with the finding, not the method: revenue alone doesn't move the needle, but how a program reinvests it does. Keep this packet ready as a follow-up, not the opener — the regression tables answer "can you back that up," they're not the headline.</w:t>
+        <w:t xml:space="preserve">Lead with the finding, not the method: revenue alone doesn't move the needle, but how a program reinvests it does. Keep this packet ready as a follow-up, not the opener: the regression tables answer "can you back that up," they're not the headline.</w:t>
       </w:r>
     </w:p>
     <w:sectPr>

</xml_diff>